<commit_message>
home page and business trends page
</commit_message>
<xml_diff>
--- a/Inventory Management business analysis/other/other.docx
+++ b/Inventory Management business analysis/other/other.docx
@@ -20,6 +20,9 @@
     </w:p>
     <w:p>
       <w:r>
+        <w:rPr>
+          <w:noProof/>
+        </w:rPr>
         <w:drawing>
           <wp:inline distT="0" distB="0" distL="0" distR="0" wp14:anchorId="3F476694" wp14:editId="313701FA">
             <wp:extent cx="4724400" cy="3352800"/>
@@ -89,6 +92,7 @@
           <w:rFonts w:ascii="Consolas" w:hAnsi="Consolas"/>
           <w:b/>
           <w:bCs/>
+          <w:noProof/>
           <w:color w:val="0D0D0D" w:themeColor="text1" w:themeTint="F2"/>
           <w:sz w:val="21"/>
           <w:szCs w:val="21"/>
@@ -153,6 +157,9 @@
     </w:p>
     <w:p>
       <w:r>
+        <w:rPr>
+          <w:noProof/>
+        </w:rPr>
         <w:drawing>
           <wp:inline distT="0" distB="0" distL="0" distR="0" wp14:anchorId="67950C6F" wp14:editId="21CAC4A9">
             <wp:extent cx="5943600" cy="2092325"/>
@@ -201,6 +208,9 @@
     </w:p>
     <w:p>
       <w:r>
+        <w:rPr>
+          <w:noProof/>
+        </w:rPr>
         <w:drawing>
           <wp:inline distT="0" distB="0" distL="0" distR="0" wp14:anchorId="63C37E45" wp14:editId="074C480D">
             <wp:extent cx="5943600" cy="2202815"/>
@@ -249,6 +259,9 @@
     </w:p>
     <w:p>
       <w:r>
+        <w:rPr>
+          <w:noProof/>
+        </w:rPr>
         <w:lastRenderedPageBreak/>
         <w:drawing>
           <wp:inline distT="0" distB="0" distL="0" distR="0" wp14:anchorId="56EC2BF1" wp14:editId="12AE99B3">
@@ -314,6 +327,9 @@
     </w:p>
     <w:p>
       <w:r>
+        <w:rPr>
+          <w:noProof/>
+        </w:rPr>
         <w:drawing>
           <wp:inline distT="0" distB="0" distL="0" distR="0" wp14:anchorId="7E0DDE55" wp14:editId="24523F88">
             <wp:extent cx="5943600" cy="2940685"/>
@@ -362,6 +378,9 @@
     </w:p>
     <w:p>
       <w:r>
+        <w:rPr>
+          <w:noProof/>
+        </w:rPr>
         <w:lastRenderedPageBreak/>
         <w:drawing>
           <wp:inline distT="0" distB="0" distL="0" distR="0" wp14:anchorId="3B484769" wp14:editId="52ADAAD9">
@@ -412,6 +431,9 @@
     </w:p>
     <w:p>
       <w:r>
+        <w:rPr>
+          <w:noProof/>
+        </w:rPr>
         <w:drawing>
           <wp:inline distT="0" distB="0" distL="0" distR="0" wp14:anchorId="36E488FB" wp14:editId="3C4EC487">
             <wp:extent cx="5943600" cy="2520315"/>
@@ -1663,6 +1685,7 @@
   <w:style w:type="character" w:default="1" w:styleId="DefaultParagraphFont">
     <w:name w:val="Default Paragraph Font"/>
     <w:uiPriority w:val="1"/>
+    <w:semiHidden/>
     <w:unhideWhenUsed/>
   </w:style>
   <w:style w:type="table" w:default="1" w:styleId="TableNormal">

</xml_diff>